<commit_message>
Update Cavalry field guide
</commit_message>
<xml_diff>
--- a/cavalry-user-guide.docx
+++ b/cavalry-user-guide.docx
@@ -11838,7 +11838,7 @@
           </w:tcPr>
           <w:p>
             <w:r>
-              <w:t xml:space="preserve">"continue without waiting", "work through the rest"</w:t>
+              <w:t xml:space="preserve">"continue without waiting", "keep going", "work through the rest"</w:t>
             </w:r>
           </w:p>
         </w:tc>
@@ -11914,7 +11914,7 @@
           </w:tcPr>
           <w:p>
             <w:r>
-              <w:t xml:space="preserve">"merge to staging yourself", "keep going, I'll promote later", or simply "use Mode C"</w:t>
+              <w:t xml:space="preserve">Explicit permission to merge: "merge to staging yourself" or "use Mode C"</w:t>
             </w:r>
           </w:p>
         </w:tc>
@@ -11951,9 +11951,9 @@
       <w:pPr>
         <w:keepLines/>
         <w:pBdr>
-          <w:left w:val="single" w:color="D97706" w:sz="24" w:space="8"/>
+          <w:left w:val="single" w:color="2563EB" w:sz="24" w:space="8"/>
         </w:pBdr>
-        <w:shd w:fill="FEF3C7" w:color="auto" w:val="clear"/>
+        <w:shd w:fill="EFF6FF" w:color="auto" w:val="clear"/>
         <w:spacing w:after="200" w:before="120"/>
         <w:ind w:left="120" w:right="120"/>
       </w:pPr>
@@ -11961,12 +11961,12 @@
         <w:rPr>
           <w:b/>
           <w:bCs/>
-          <w:color w:val="D97706"/>
-        </w:rPr>
-        <w:t xml:space="preserve">Watch out  </w:t>
-      </w:r>
-      <w:r>
-        <w:t xml:space="preserve">"Keep going" appears in the trigger phrases of both Mode B and Mode C. Name the mode ("use Mode C") so there's no ambiguity.</w:t>
+          <w:color w:val="2563EB"/>
+        </w:rPr>
+        <w:t xml:space="preserve">Note  </w:t>
+      </w:r>
+      <w:r>
+        <w:t xml:space="preserve">Mode C only starts on explicit permission to merge. "Keep going" on its own doesn't say whether Charge may merge, so it asks whether you mean Mode B or Mode C. Ambiguity never resolves toward merging.</w:t>
       </w:r>
     </w:p>
     <w:p>
@@ -22766,7 +22766,7 @@
           </w:tcPr>
           <w:p>
             <w:r>
-              <w:t xml:space="preserve">"Keep going" (ambiguous)</w:t>
+              <w:t xml:space="preserve">"Keep going" on its own</w:t>
             </w:r>
           </w:p>
         </w:tc>
@@ -22788,7 +22788,7 @@
           </w:tcPr>
           <w:p>
             <w:r>
-              <w:t xml:space="preserve">May pick B or C: the phrase is listed for both</w:t>
+              <w:t xml:space="preserve">Asks whether you mean Mode B or Mode C before starting</w:t>
             </w:r>
           </w:p>
         </w:tc>
@@ -22810,7 +22810,7 @@
           </w:tcPr>
           <w:p>
             <w:r>
-              <w:t xml:space="preserve">Say "Mode B" or "Mode C"</w:t>
+              <w:t xml:space="preserve">Say "use Mode C" if you want it to merge</w:t>
             </w:r>
           </w:p>
         </w:tc>

</xml_diff>